<commit_message>
Shrink paper PDF from 1.06 MB to 0.37 MB so it renders in the viewer
Co-authored-by: arena-agent <297053741+arena-agent@users.noreply.github.com>
</commit_message>
<xml_diff>
--- a/docs/paper-humanised/XAI_Modality_Bias_Paper_Humanised.docx
+++ b/docs/paper-humanised/XAI_Modality_Bias_Paper_Humanised.docx
@@ -1067,7 +1067,7 @@
       <w:r>
         <w:drawing>
           <wp:inline xmlns:a="http://schemas.openxmlformats.org/drawingml/2006/main" xmlns:pic="http://schemas.openxmlformats.org/drawingml/2006/picture">
-            <wp:extent cx="5669280" cy="3003669"/>
+            <wp:extent cx="5669280" cy="3002619"/>
             <wp:docPr id="1" name="Picture 1"/>
             <wp:cNvGraphicFramePr>
               <a:graphicFrameLocks noChangeAspect="1"/>
@@ -1076,7 +1076,7 @@
               <a:graphicData uri="http://schemas.openxmlformats.org/drawingml/2006/picture">
                 <pic:pic>
                   <pic:nvPicPr>
-                    <pic:cNvPr id="0" name="fig1.png"/>
+                    <pic:cNvPr id="0" name="fig1.jpg"/>
                     <pic:cNvPicPr/>
                   </pic:nvPicPr>
                   <pic:blipFill>
@@ -1088,7 +1088,7 @@
                   <pic:spPr>
                     <a:xfrm>
                       <a:off x="0" y="0"/>
-                      <a:ext cx="5669280" cy="3003669"/>
+                      <a:ext cx="5669280" cy="3002619"/>
                     </a:xfrm>
                     <a:prstGeom prst="rect"/>
                   </pic:spPr>
@@ -4320,7 +4320,7 @@
       <w:r>
         <w:drawing>
           <wp:inline xmlns:a="http://schemas.openxmlformats.org/drawingml/2006/main" xmlns:pic="http://schemas.openxmlformats.org/drawingml/2006/picture">
-            <wp:extent cx="5669280" cy="3069727"/>
+            <wp:extent cx="5669280" cy="3069810"/>
             <wp:docPr id="2" name="Picture 2"/>
             <wp:cNvGraphicFramePr>
               <a:graphicFrameLocks noChangeAspect="1"/>
@@ -4329,7 +4329,7 @@
               <a:graphicData uri="http://schemas.openxmlformats.org/drawingml/2006/picture">
                 <pic:pic>
                   <pic:nvPicPr>
-                    <pic:cNvPr id="0" name="fig2.png"/>
+                    <pic:cNvPr id="0" name="fig2.jpg"/>
                     <pic:cNvPicPr/>
                   </pic:nvPicPr>
                   <pic:blipFill>
@@ -4341,7 +4341,7 @@
                   <pic:spPr>
                     <a:xfrm>
                       <a:off x="0" y="0"/>
-                      <a:ext cx="5669280" cy="3069727"/>
+                      <a:ext cx="5669280" cy="3069810"/>
                     </a:xfrm>
                     <a:prstGeom prst="rect"/>
                   </pic:spPr>
@@ -7671,7 +7671,7 @@
       <w:r>
         <w:drawing>
           <wp:inline xmlns:a="http://schemas.openxmlformats.org/drawingml/2006/main" xmlns:pic="http://schemas.openxmlformats.org/drawingml/2006/picture">
-            <wp:extent cx="5669280" cy="1989494"/>
+            <wp:extent cx="5669280" cy="1990547"/>
             <wp:docPr id="3" name="Picture 3"/>
             <wp:cNvGraphicFramePr>
               <a:graphicFrameLocks noChangeAspect="1"/>
@@ -7680,7 +7680,7 @@
               <a:graphicData uri="http://schemas.openxmlformats.org/drawingml/2006/picture">
                 <pic:pic>
                   <pic:nvPicPr>
-                    <pic:cNvPr id="0" name="fig3.png"/>
+                    <pic:cNvPr id="0" name="fig3.jpg"/>
                     <pic:cNvPicPr/>
                   </pic:nvPicPr>
                   <pic:blipFill>
@@ -7692,7 +7692,7 @@
                   <pic:spPr>
                     <a:xfrm>
                       <a:off x="0" y="0"/>
-                      <a:ext cx="5669280" cy="1989494"/>
+                      <a:ext cx="5669280" cy="1990547"/>
                     </a:xfrm>
                     <a:prstGeom prst="rect"/>
                   </pic:spPr>
@@ -8496,7 +8496,7 @@
       <w:r>
         <w:drawing>
           <wp:inline xmlns:a="http://schemas.openxmlformats.org/drawingml/2006/main" xmlns:pic="http://schemas.openxmlformats.org/drawingml/2006/picture">
-            <wp:extent cx="5669280" cy="2413038"/>
+            <wp:extent cx="5669280" cy="2414693"/>
             <wp:docPr id="4" name="Picture 4"/>
             <wp:cNvGraphicFramePr>
               <a:graphicFrameLocks noChangeAspect="1"/>
@@ -8505,7 +8505,7 @@
               <a:graphicData uri="http://schemas.openxmlformats.org/drawingml/2006/picture">
                 <pic:pic>
                   <pic:nvPicPr>
-                    <pic:cNvPr id="0" name="fig4.png"/>
+                    <pic:cNvPr id="0" name="fig4.jpg"/>
                     <pic:cNvPicPr/>
                   </pic:nvPicPr>
                   <pic:blipFill>
@@ -8517,7 +8517,7 @@
                   <pic:spPr>
                     <a:xfrm>
                       <a:off x="0" y="0"/>
-                      <a:ext cx="5669280" cy="2413038"/>
+                      <a:ext cx="5669280" cy="2414693"/>
                     </a:xfrm>
                     <a:prstGeom prst="rect"/>
                   </pic:spPr>

</xml_diff>

<commit_message>
Match the original paper's PDF layout: Times body 11pt, Letter, 57pt margins, sans headings
Co-authored-by: arena-agent <297053741+arena-agent@users.noreply.github.com>
</commit_message>
<xml_diff>
--- a/docs/paper-humanised/XAI_Modality_Bias_Paper_Humanised.docx
+++ b/docs/paper-humanised/XAI_Modality_Bias_Paper_Humanised.docx
@@ -23,12 +23,41 @@
         </w:rPr>
         <w:t>Nishant (I24AI028)</w:t>
       </w:r>
+    </w:p>
+    <w:p>
       <w:r>
         <w:rPr>
           <w:b w:val="0"/>
           <w:i w:val="0"/>
         </w:rPr>
-        <w:t xml:space="preserve"> Project team: I24AI001, I24AI009, I24AI026, I24AI028 Sardar Vallabhbhai National Institute of Technology, Surat Integrated Artificial Intelligence Program — Deep Learning Semester Project 13 October 2026</w:t>
+        <w:t>Project team: I24AI001   I24AI009   I24AI026   I24AI028</w:t>
+      </w:r>
+    </w:p>
+    <w:p>
+      <w:r>
+        <w:rPr>
+          <w:b w:val="0"/>
+          <w:i w:val="0"/>
+        </w:rPr>
+        <w:t>Sardar Vallabhbhai National Institute of Technology, Surat</w:t>
+      </w:r>
+    </w:p>
+    <w:p>
+      <w:r>
+        <w:rPr>
+          <w:b w:val="0"/>
+          <w:i w:val="0"/>
+        </w:rPr>
+        <w:t>Integrated Artificial Intelligence Program — Deep Learning Semester Project</w:t>
+      </w:r>
+    </w:p>
+    <w:p>
+      <w:r>
+        <w:rPr>
+          <w:b w:val="0"/>
+          <w:i w:val="0"/>
+        </w:rPr>
+        <w:t>13 October 2026</w:t>
       </w:r>
     </w:p>
     <w:p>
@@ -115,7 +144,7 @@
           <w:b/>
           <w:sz w:val="26"/>
         </w:rPr>
-        <w:t>1. Introduction</w:t>
+        <w:t>1 Introduction</w:t>
       </w:r>
     </w:p>
     <w:p>
@@ -189,7 +218,7 @@
           <w:b/>
           <w:sz w:val="26"/>
         </w:rPr>
-        <w:t>2. Background and Related Work</w:t>
+        <w:t>2 Background and Related Work</w:t>
       </w:r>
     </w:p>
     <w:p>
@@ -309,7 +338,7 @@
           <w:b/>
           <w:sz w:val="26"/>
         </w:rPr>
-        <w:t>3. Study Scope and Data</w:t>
+        <w:t>3 Study Scope and Data</w:t>
       </w:r>
     </w:p>
     <w:p>
@@ -839,7 +868,7 @@
           <w:b/>
           <w:sz w:val="26"/>
         </w:rPr>
-        <w:t>4. Methodology</w:t>
+        <w:t>4 Methodology</w:t>
       </w:r>
     </w:p>
     <w:p>
@@ -2289,7 +2318,7 @@
           <w:b/>
           <w:sz w:val="26"/>
         </w:rPr>
-        <w:t>5. Experimental Design</w:t>
+        <w:t>5 Experimental Design</w:t>
       </w:r>
     </w:p>
     <w:p>
@@ -3234,7 +3263,7 @@
           <w:b/>
           <w:sz w:val="26"/>
         </w:rPr>
-        <w:t>6. Results</w:t>
+        <w:t>6 Results</w:t>
       </w:r>
     </w:p>
     <w:p>
@@ -8569,7 +8598,7 @@
           <w:b/>
           <w:sz w:val="26"/>
         </w:rPr>
-        <w:t>7. Discussion</w:t>
+        <w:t>7 Discussion</w:t>
       </w:r>
     </w:p>
     <w:p>
@@ -8675,7 +8704,7 @@
           <w:b/>
           <w:sz w:val="26"/>
         </w:rPr>
-        <w:t>8. Limitations and Threats to Validity</w:t>
+        <w:t>8 Limitations and Threats to Validity</w:t>
       </w:r>
     </w:p>
     <w:p>
@@ -8724,7 +8753,7 @@
           <w:b/>
           <w:sz w:val="26"/>
         </w:rPr>
-        <w:t>9. Future Work</w:t>
+        <w:t>9 Future Work</w:t>
       </w:r>
     </w:p>
     <w:p>
@@ -8764,7 +8793,7 @@
           <w:b/>
           <w:sz w:val="26"/>
         </w:rPr>
-        <w:t>10. Conclusion</w:t>
+        <w:t>10 Conclusion</w:t>
       </w:r>
     </w:p>
     <w:p>

</xml_diff>